<commit_message>
feat: dataviz interativo, correcoes do relatorio e reexecucao completa dos notebooks
- Board Plotly (mapa coropletico por regiao, gauges, sunburst, funil, heatmap,
  radar) e app Streamlit replicando os 15 graficos do material executivo, ambos
  com exportacao para PDF (consumption/streamlit_dashboard/ e
  consumption/streamlit_app/).
- Relatorio tecnico e material executivo corrigidos (premissas P1-P8, Tabela 11,
  secao 4.4, contagem de hipoteses testadas) e exportados em pptx.
- Pasta evidence/ com nomes de arquivo alinhados ao conteudo real, duplicatas
  removidas, README sincronizado com os artefatos finais (E01-E08).
- Notebooks 02, 03 e 05 reexecutados por completo: corrige colisao de rotulo no
  grafico G11 (presente tambem na Figura 12 do relatorio tecnico) e preenche 4
  celulas que geravam tabelas centrais (bootstrap da Premissa P8,
  gold_gender_role_seniority, gold_genai_usage, gold_regions) sem
  execution_count salvo. Os 21 CSVs Gold conferem byte-identicos antes/depois.
</commit_message>
<xml_diff>
--- a/docs/technical_report_phase3_v1.docx
+++ b/docs/technical_report_phase3_v1.docx
@@ -5404,7 +5404,7 @@
           <w:color w:val="000000"/>
           <w:sz w:val="20"/>
         </w:rPr>
-        <w:t xml:space="preserve">O método segue quatro etapas: (i) ingestão das seis edições no S3 (camada Bronze, imutável); (ii) harmonização de esquemas e categorias em PySpark, com de-para versionado e premissas registradas (Silver); (iii) agregações analíticas por tema (Gold, 20 tabelas); e (iv) consultas SQL no Athena e geração de gráficos sobre agregados. Todas as proporções de questões multirresposta usam como denominador os </w:t>
+        <w:t xml:space="preserve">O método segue quatro etapas: (i) ingestão das seis edições no S3 (camada Bronze, imutável); (ii) harmonização de esquemas e categorias em PySpark, com de-para versionado e premissas registradas (Silver); (iii) agregações analíticas por tema (Gold, 21 tabelas); e (iv) consultas SQL no Athena e geração de gráficos sobre agregados. Todas as proporções de questões multirresposta usam como denominador os </w:t>
       </w:r>
       <w:r>
         <w:rPr>
@@ -5466,6 +5466,26 @@
           <w:sz w:val="20"/>
         </w:rPr>
         <w:t>Foram utilizadas as seis edições públicas da pesquisa (Kaggle). As três últimas formam o núcleo obrigatório; as demais entram apenas como série histórica em indicadores de longo prazo (gênero, linguagens e cloud), decisão registrada como premissa P1.</w:t>
+      </w:r>
+    </w:p>
+    <w:p>
+      <w:pPr>
+        <w:spacing w:after="120"/>
+        <w:jc w:val="both"/>
+        <w:rPr>
+          <w:rFonts w:ascii="Arial" w:hAnsi="Arial" w:cs="Arial"/>
+          <w:sz w:val="20"/>
+        </w:rPr>
+      </w:pPr>
+      <w:r>
+        <w:rPr>
+          <w:rFonts w:ascii="Arial" w:hAnsi="Arial" w:cs="Arial"/>
+          <w:i/>
+          <w:iCs/>
+          <w:color w:val="000000"/>
+          <w:sz w:val="20"/>
+        </w:rPr>
+        <w:t xml:space="preserve">Nota: embora a descrição do dataset no edital tome 2021 como referência histórica padrão, a edição de 2019 foi mantida exclusivamente para estender a série temporal dos indicadores de gênero, linguagens e cloud.</w:t>
       </w:r>
     </w:p>
     <w:p>
@@ -8262,6 +8282,24 @@
           <w:sz w:val="20"/>
         </w:rPr>
         <w:t>As bases são publicadas anonimizadas na origem pelo Data Hackers. O projeto opera exclusivamente com estatísticas agregadas, sem qualquer tentativa de reidentificação (vedada pela LGPD), cita fonte, edição e n amostral em todos os gráficos e tabelas, e adota os controles de segurança da Seção 3.3 — atendendo ao bloco regulatório definido para o projeto.</w:t>
+      </w:r>
+    </w:p>
+    <w:p>
+      <w:pPr>
+        <w:spacing w:after="120"/>
+        <w:jc w:val="both"/>
+        <w:rPr>
+          <w:rFonts w:ascii="Arial" w:hAnsi="Arial" w:cs="Arial"/>
+          <w:sz w:val="20"/>
+        </w:rPr>
+      </w:pPr>
+      <w:r>
+        <w:rPr>
+          <w:rFonts w:ascii="Arial" w:hAnsi="Arial" w:cs="Arial"/>
+          <w:color w:val="000000"/>
+          <w:sz w:val="20"/>
+        </w:rPr>
+        <w:t xml:space="preserve">Esse tratamento cobre o dataset público usado neste projeto. Se a instituição financeira adotar a mesma arquitetura sobre seus próprios dados de RH e candidatos — não públicos, não anonimizados — a base legal, o direito do titular, a retenção e os controles de segurança cibernética (Resolução BACEN 4.658/2021, aplicável a instituições financeiras) precisam ser reavaliados; esse é um requisito da fase de implementação, fora do escopo analítico deste relatório.</w:t>
       </w:r>
     </w:p>
     <w:p>
@@ -9709,7 +9747,7 @@
                 <w:color w:val="000000"/>
                 <w:sz w:val="20"/>
               </w:rPr>
-              <w:t>20 tabelas analíticas agregadas por tema</w:t>
+              <w:t>21 tabelas analíticas agregadas por tema</w:t>
             </w:r>
           </w:p>
         </w:tc>
@@ -10017,6 +10055,33 @@
         </w:tc>
       </w:tr>
     </w:tbl>
+    <w:p>
+      <w:pPr>
+        <w:spacing w:before="120" w:after="120"/>
+        <w:jc w:val="both"/>
+        <w:rPr>
+          <w:rFonts w:ascii="Arial" w:hAnsi="Arial" w:cs="Arial"/>
+          <w:sz w:val="20"/>
+        </w:rPr>
+      </w:pPr>
+      <w:r>
+        <w:rPr>
+          <w:rFonts w:ascii="Arial" w:hAnsi="Arial" w:cs="Arial"/>
+          <w:b/>
+          <w:color w:val="000000"/>
+          <w:sz w:val="20"/>
+        </w:rPr>
+        <w:t xml:space="preserve">Alternativas consideradas. </w:t>
+      </w:r>
+      <w:r>
+        <w:rPr>
+          <w:rFonts w:ascii="Arial" w:hAnsi="Arial" w:cs="Arial"/>
+          <w:color w:val="000000"/>
+          <w:sz w:val="20"/>
+        </w:rPr>
+        <w:t xml:space="preserve">A escolha de Glue — não EMR/Databricks — e Athena — não Redshift — segue o mesmo critério de adequação ao volume e ao formato do Lab, não preferência de fornecedor. Glue é serverless, com custo por execução e sem cluster para provisionar/desligar, adequado a um pipeline batch de poucos minutos; EMR/Databricks fariam sentido a partir de um volume ou de uma cadência de execução que este projeto não tem. Athena é serverless e cobra por TB escaneado — para um datalake desta escala (dezenas de MB), o custo por consulta é irrelevante e não há cluster provisionado ocioso entre consultas, ao contrário de um Redshift dedicado.</w:t>
+      </w:r>
+    </w:p>
     <w:p>
       <w:pPr>
         <w:rPr>
@@ -11135,7 +11200,7 @@
           <w:color w:val="000000"/>
           <w:sz w:val="20"/>
         </w:rPr>
-        <w:t>O Glue Job 2 materializa 20 tabelas agregadas (englobando respondentes, cargos, senioridade, salários por nível e por cargo, participação e gaps de gênero, tecnologias, prioridade de IA, uso de GenAI, regiões, modelos de trabalho, termômetro de mercado, intenção de mudança, critérios de escolha de emprego e desafios de gestores), cada uma gravada em Parquet (consulta) e CSV (consumo direto pelos gráficos). Os percentuais de questões multirresposta usam como denominador a base de respondentes válidos de cada pergunta (premissa P6).</w:t>
+        <w:t>O Glue Job 2 materializa 21 tabelas agregadas (englobando respondentes, cargos, senioridade, salários por nível e por cargo, participação e gaps de gênero, tecnologias, prioridade de IA, uso de GenAI, regiões, modelos de trabalho, termômetro de mercado, intenção de mudança, critérios de escolha de emprego e desafios de gestores), cada uma gravada em Parquet (consulta) e CSV (consumo direto pelos gráficos). Os percentuais de questões multirresposta usam como denominador a base de respondentes válidos de cada pergunta (premissa P6).</w:t>
       </w:r>
     </w:p>
     <w:p>
@@ -11179,7 +11244,7 @@
           <w:color w:val="000000"/>
           <w:sz w:val="20"/>
         </w:rPr>
-        <w:t>As tabelas Silver e Gold são registradas no Glue Data Catalog (crawler ou DDL com MSCK REPAIR para as partições) e consultadas no Athena. As sete consultas Q1–Q7 do notebook 04 reproduzem, em SQL portável (Spark 3.x/Athena), os números-chave usados nas seções analíticas.</w:t>
+        <w:t>A camada Gold é gerada nativamente via PySpark — pela execução automatizada do Glue Job 2 ou, de forma interativa e equivalente, pelo notebook 03 rodando no Glue Notebook. As tabelas Silver e Gold são registradas no Glue Data Catalog (crawler ou DDL com MSCK REPAIR para as partições). O Amazon Athena é empregado como motor de consulta ad-hoc e validação de schema sobre esse catálogo, servindo para auditoria e execução das queries analíticas (Q1 a Q7).</w:t>
       </w:r>
     </w:p>
     <w:p>
@@ -11749,7 +11814,7 @@
                 <w:color w:val="000000"/>
                 <w:sz w:val="20"/>
               </w:rPr>
-              <w:t>20</w:t>
+              <w:t>21</w:t>
             </w:r>
           </w:p>
         </w:tc>
@@ -15012,7 +15077,7 @@
                 <w:color w:val="000000"/>
                 <w:sz w:val="20"/>
               </w:rPr>
-              <w:t>R$ 14.001</w:t>
+              <w:t>—</w:t>
             </w:r>
           </w:p>
         </w:tc>
@@ -15042,7 +15107,7 @@
                 <w:color w:val="000000"/>
                 <w:sz w:val="20"/>
               </w:rPr>
-              <w:t>19</w:t>
+              <w:t>—</w:t>
             </w:r>
           </w:p>
         </w:tc>
@@ -15419,7 +15484,7 @@
           <w:color w:val="000000"/>
           <w:sz w:val="20"/>
         </w:rPr>
-        <w:t>Nota: "Sênior+" inclui Especialista/Staff+ no numerador do percentual; as colunas de mediana e n consideram apenas o nível Sênior stricto sensu (Especialista/Staff+ é tratado à parte na Tabela 10).</w:t>
+        <w:t>Nota: "Sênior+" inclui Especialista/Staff+ no numerador do percentual; as colunas de mediana e n consideram apenas o nível Sênior stricto sensu (Especialista/Staff+ é tratado à parte na Tabela 10). Em Produto (DPM/PM), mediana e n aparecem como “—”: o subconjunto Sênior tem apenas 19 pessoas, abaixo do corte de estabilidade da Premissa P8 (n ≥ 30); o percentual Sênior+ (87,9%) permanece porque é calculado sobre os 33 respondentes do grupo total, que atende ao corte.</w:t>
       </w:r>
     </w:p>
     <w:p>
@@ -16522,6 +16587,14 @@
         </w:rPr>
         <w:t>O gap não desaparece quando cargo e senioridade são fixados simultaneamente, mas deixa de ser uniforme: em Ciência de Dados e Análise de Dados as medianas são idênticas entre gêneros; em Engenharia/Arquitetura de Dados, ao contrário, a mediana feminina fica 28,6% abaixo da masculina no mesmo nível.</w:t>
       </w:r>
+      <w:r>
+        <w:rPr>
+          <w:rFonts w:ascii="Arial" w:hAnsi="Arial" w:cs="Arial"/>
+          <w:color w:val="000000"/>
+          <w:sz w:val="20"/>
+        </w:rPr>
+        <w:t xml:space="preserve"> Estes valores (R$ 10.001 feminino, R$ 14.001 masculino) também estão na coluna salario_mediano_pm de gold_gender_role_seniority, tornando a Causa 2 igualmente auditável a partir do pipeline.</w:t>
+      </w:r>
     </w:p>
     <w:p>
       <w:pPr>
@@ -17913,6 +17986,42 @@
           <w:sz w:val="20"/>
         </w:rPr>
         <w:t xml:space="preserve"> — +36,0 p.p., um crescimento de 6,6 vezes; Copilots alcançam 29,8%. O uso migrou do gratuito e não governado (shadow AI) para o corporativo licenciado — para um banco regulado, prover ferramenta oficial com governança é simultaneamente ganho de produtividade e mitigação de risco de vazamento de dados.</w:t>
+      </w:r>
+    </w:p>
+    <w:p>
+      <w:pPr>
+        <w:spacing w:after="120"/>
+        <w:jc w:val="both"/>
+        <w:rPr>
+          <w:rFonts w:ascii="Arial" w:hAnsi="Arial" w:cs="Arial"/>
+          <w:sz w:val="20"/>
+        </w:rPr>
+      </w:pPr>
+      <w:r>
+        <w:rPr>
+          <w:rFonts w:ascii="Arial" w:hAnsi="Arial" w:cs="Arial"/>
+          <w:color w:val="000000"/>
+          <w:sz w:val="20"/>
+        </w:rPr>
+        <w:t xml:space="preserve">O corte por senioridade (tabela Gold gold_genai_usage_by_seniority, adicionada para tornar este recorte auditável a partir do pipeline) mostra que o uso pago pela empresa não está distribuído igualmente pela pirâmide: sobe de 30,3% no Júnior para 40,8% no Pleno, 45,6% no Sênior e </w:t>
+      </w:r>
+      <w:r>
+        <w:rPr>
+          <w:rFonts w:ascii="Arial" w:hAnsi="Arial" w:cs="Arial"/>
+          <w:b/>
+          <w:bCs/>
+          <w:color w:val="000000"/>
+          <w:sz w:val="20"/>
+        </w:rPr>
+        <w:t>53,3%</w:t>
+      </w:r>
+      <w:r>
+        <w:rPr>
+          <w:rFonts w:ascii="Arial" w:hAnsi="Arial" w:cs="Arial"/>
+          <w:color w:val="000000"/>
+          <w:sz w:val="20"/>
+        </w:rPr>
+        <w:t xml:space="preserve"> no Especialista/Staff+ — um gap de 23 pontos percentuais entre as pontas (edição 2025/26). A adoção corporativa de GenAI ainda segue a mesma hierarquia de acesso que separa os demais recortes deste relatório: quem já está mais avançado na carreira também captura mais cedo o benefício da ferramenta paga pela empresa.</w:t>
       </w:r>
     </w:p>
     <w:p>
@@ -21082,6 +21191,35 @@
     </w:p>
     <w:p>
       <w:pPr>
+        <w:pStyle w:val="PargrafodaLista"/>
+        <w:numPr>
+          <w:ilvl w:val="0"/>
+          <w:numId w:val="21"/>
+        </w:numPr>
+        <w:spacing w:after="80"/>
+        <w:rPr>
+          <w:rFonts w:ascii="Arial" w:hAnsi="Arial" w:cs="Arial"/>
+        </w:rPr>
+      </w:pPr>
+      <w:r>
+        <w:rPr>
+          <w:rFonts w:ascii="Arial" w:hAnsi="Arial" w:cs="Arial"/>
+          <w:b/>
+          <w:bCs/>
+          <w:color w:val="000000"/>
+        </w:rPr>
+        <w:t xml:space="preserve">Ordem de grandeza de custo (FinOps) </w:t>
+      </w:r>
+      <w:r>
+        <w:rPr>
+          <w:rFonts w:ascii="Arial" w:hAnsi="Arial" w:cs="Arial"/>
+          <w:color w:val="000000"/>
+        </w:rPr>
+        <w:t xml:space="preserve">— nos volumes atuais (57 MB no datalake completo) a infraestrutura custa centavos por mês: armazenamento S3 (~US$ 0,023/GB-mês) é irrelevante nesta escala; cada execução dos dois Glue Jobs (2 workers G.1X, ~US$ 0,44/DPU-hora) custa poucos centavos; Athena (US$ 5,00/TB escaneado) cobra frações de centavo por consulta graças ao particionamento por ano=YYYY. Em produção sobre dados reais do banco, o custo escalaria com a frequência de execução e o volume por Job, não com o tamanho do dataset desta pesquisa — o dimensionamento completo fica para a Fase 2.</w:t>
+      </w:r>
+    </w:p>
+    <w:p>
+      <w:pPr>
         <w:pStyle w:val="Ttulo3"/>
       </w:pPr>
       <w:bookmarkStart w:id="161" w:name="_Toc237938419"/>
@@ -22295,6 +22433,41 @@
         </w:rPr>
         <w:t>publicar a política de uso de GenAI, disponibilizar a ferramenta oficial licenciada, lançar a trilha Python + SQL e revisar as bandas salariais contra as medianas desta pesquisa.</w:t>
       </w:r>
+    </w:p>
+    <w:p>
+      <w:pPr>
+        <w:spacing w:before="120" w:after="120"/>
+        <w:jc w:val="both"/>
+        <w:rPr>
+          <w:rFonts w:ascii="Arial" w:hAnsi="Arial" w:cs="Arial"/>
+          <w:sz w:val="20"/>
+        </w:rPr>
+      </w:pPr>
+      <w:r>
+        <w:rPr>
+          <w:rFonts w:ascii="Arial" w:hAnsi="Arial" w:cs="Arial"/>
+          <w:b/>
+          <w:color w:val="000000"/>
+          <w:sz w:val="20"/>
+        </w:rPr>
+        <w:t xml:space="preserve">Próximos passos de engenharia — produtizar o pipeline. </w:t>
+      </w:r>
+      <w:r>
+        <w:rPr>
+          <w:rFonts w:ascii="Arial" w:hAnsi="Arial" w:cs="Arial"/>
+          <w:color w:val="000000"/>
+          <w:sz w:val="20"/>
+        </w:rPr>
+        <w:t xml:space="preserve">Os quick wins acima são de negócio; a arquitetura em si (Seção 3) precisa de quatro peças antes de sustentar decisão em produção: orquestração agendada dos dois Glue Jobs (EventBridge + Step Functions — hoje disparo manual pelo console); alerta de falha (CloudWatch + SNS — hoje sem monitoramento); carga incremental (hoje cada execução sobrescreve a camada inteira, adequado aos 6 CSVs fixos da pesquisa, não a um fluxo contínuo); e um mínimo de CI para os scripts PySpark antes de promover qualquer mudança para produção.</w:t>
+      </w:r>
+    </w:p>
+    <w:p>
+      <w:pPr>
+        <w:rPr>
+          <w:rFonts w:ascii="Arial" w:hAnsi="Arial"/>
+          <w:sz w:val="20"/>
+        </w:rPr>
+      </w:pPr>
       <w:bookmarkStart w:id="164" w:name="_Toc237938420"/>
       <w:bookmarkStart w:id="165" w:name="_Toc237955154"/>
       <w:r>
@@ -23202,6 +23375,60 @@
     </w:p>
     <w:p>
       <w:pPr>
+        <w:spacing w:after="120"/>
+        <w:jc w:val="both"/>
+        <w:rPr>
+          <w:rFonts w:ascii="Arial" w:hAnsi="Arial" w:cs="Arial"/>
+          <w:sz w:val="20"/>
+        </w:rPr>
+      </w:pPr>
+      <w:r>
+        <w:rPr>
+          <w:rFonts w:ascii="Arial" w:hAnsi="Arial" w:cs="Arial"/>
+          <w:b/>
+          <w:color w:val="000000"/>
+          <w:sz w:val="20"/>
+        </w:rPr>
+        <w:t xml:space="preserve">Escala validada versus escala de produção. </w:t>
+      </w:r>
+      <w:r>
+        <w:rPr>
+          <w:rFonts w:ascii="Arial" w:hAnsi="Arial" w:cs="Arial"/>
+          <w:color w:val="000000"/>
+          <w:sz w:val="20"/>
+        </w:rPr>
+        <w:t xml:space="preserve">O pipeline foi validado em 22.686 linhas processadas em lote anual — volume trivial para qualquer engine moderna. A arquitetura aqui construída é o blueprint mínimo (Seção 3.1), não uma validação de escala: dados reais de RH/operações de uma instituição financeira de grande porte têm ordens de grandeza a mais e cadência mais frequente que uma pesquisa anual. Levar esta arquitetura a produção exigiria revisar o número de workers do Glue (hoje fixo em 2×G.1X, sem auto scaling), remover o coalesce(1) na gravação do CSV Gold (adequado a agregados pequenos, não a cargas maiores) e avaliar processamento por streaming caso a cadência deixe de ser em lote.</w:t>
+      </w:r>
+    </w:p>
+    <w:p>
+      <w:pPr>
+        <w:spacing w:after="120"/>
+        <w:jc w:val="both"/>
+        <w:rPr>
+          <w:rFonts w:ascii="Arial" w:hAnsi="Arial" w:cs="Arial"/>
+          <w:sz w:val="20"/>
+        </w:rPr>
+      </w:pPr>
+      <w:r>
+        <w:rPr>
+          <w:rFonts w:ascii="Arial" w:hAnsi="Arial" w:cs="Arial"/>
+          <w:b/>
+          <w:color w:val="000000"/>
+          <w:sz w:val="20"/>
+        </w:rPr>
+        <w:t xml:space="preserve">Escopo da governança de dados. </w:t>
+      </w:r>
+      <w:r>
+        <w:rPr>
+          <w:rFonts w:ascii="Arial" w:hAnsi="Arial" w:cs="Arial"/>
+          <w:color w:val="000000"/>
+          <w:sz w:val="20"/>
+        </w:rPr>
+        <w:t xml:space="preserve">A Seção 2 rastreia premissas metodológicas e a Tabela 19 mapeia riscos do projeto analítico entregue — governança de dado em produção (papéis e responsabilidades, política de qualidade contínua, monitoramento) não faz parte deste escopo. Riscos operacionais da plataforma recomendada — falha de job sem alerta, dependência de fornecedor, ownership da camada Silver em produção — ficam para a fase de implementação.</w:t>
+      </w:r>
+    </w:p>
+    <w:p>
+      <w:pPr>
         <w:pStyle w:val="Ttulo3"/>
       </w:pPr>
       <w:bookmarkStart w:id="171" w:name="_Toc237938423"/>
@@ -24452,7 +24679,7 @@
           <w:rFonts w:ascii="Arial" w:hAnsi="Arial" w:cs="Arial"/>
           <w:color w:val="000000"/>
         </w:rPr>
-        <w:t>AWS BUILDERS. Medallion Architecture on AWS (S3 + Glue + Athena). Disponível em: https://dev.to/aws-builders/medallion-architecture-on-aws-2ngm. Acesso em: 26 ago. 2026.</w:t>
+        <w:t>AWS BUILDERS (comunidade dev.to, publicação não oficial). Medallion Architecture on AWS (S3 + Glue + Athena). Disponível em: https://dev.to/aws-builders/medallion-architecture-on-aws-2ngm. Acesso em: 26 ago. 2026.</w:t>
       </w:r>
     </w:p>
     <w:p>

</xml_diff>